<commit_message>
Docs: add spec (EN + VI), shorten demo timeline from 17 to 12 weeks (max 15)
- Add docs/spec/SPEC.md and SPEC.vi.md: requirements, current status checked
  against the prototype, as-built architecture, engine contract, schedule,
  discrepancies, open questions and risks.
- Schedule: 12 weeks planned, T13-15 contingency reserve, hard stop at 15.
  Advisor approval moves to end of T4, school commitment to T5, F9 cut at T7,
  end-to-end at T9, trial T10-11, report T12.
- Update the PRD (.docx) to the same plan, including a redrawn Gantt chart.
- prototype/README.md: mark the class-distribution chart (F10) as not built
  and use the UI label "Nội dung minh họa, chưa được chuyên gia duyệt".

Co-Authored-By: Claude Sonnet 5.5 <noreply@anthropic.com>
</commit_message>
<xml_diff>
--- a/docs/prd/PRD và lộ trình demo Mô phỏng lịch sử 3D.docx
+++ b/docs/prd/PRD và lộ trình demo Mô phỏng lịch sử 3D.docx
@@ -23,6 +23,12 @@
       </w:r>
     </w:p>
     <w:p>
+      <w:pPr/>
+      <w:r>
+        <w:t xml:space="preserve">Cập nhật lộ trình 01/11/2026: rút lộ trình từ 17 tuần xuống 12 tuần (tối đa 15 tuần; T13-15 là quỹ dự phòng chỉ dùng khi trễ, không phải việc đã lên lịch), dời các mốc kiểm soát sớm hơn (cố vấn duyệt kho dữ liệu cuối T4), giữ bước 0 (prototype v1.0 đã xong), tách rõ phần P0 và P1 của bước 7, thêm 2 rủi ro (lịch trường, sự đồng ý của phụ huynh). Ngày bắt đầu T1 vẫn chưa chốt.</w:t>
+      </w:r>
+    </w:p>
+    <w:p>
       <w:pPr>
         <w:pStyle w:val="Heading2"/>
       </w:pPr>
@@ -33,7 +39,7 @@
     <w:p>
       <w:pPr/>
       <w:r>
-        <w:t xml:space="preserve">Bản demo bài Ngọc Hồi - Hạ Hồi cần khoảng 16 tuần qua 10 bước, với một team 4-5 người làm toàn thời gian; nếu làm bán thời gian, thời gian sẽ kéo dài thêm.</w:t>
+        <w:t xml:space="preserve">Bản demo bài Ngọc Hồi - Hạ Hồi cần 12 tuần qua 10 bước (bước 0 là prototype đã xong trước T1, không tính vào 12 tuần), tối đa 15 tuần nếu dùng quỹ dự phòng T13-15, với một team 4-5 người làm toàn thời gian; nếu làm bán thời gian, hãy lập kế hoạch theo mức tối đa 15 tuần.</w:t>
       </w:r>
     </w:p>
     <w:p>
@@ -41,13 +47,13 @@
       <w:r>
         <w:drawing>
           <wp:inline distT="0" distB="0" distL="0" distR="0">
-            <wp:extent cx="5486400" cy="2881992"/>
-            <wp:docPr id="1" name="image1" descr="lộ trình demo · 10 bước, 16 tuần"/>
+            <wp:extent cx="5486400" cy="3093835"/>
+            <wp:docPr id="1" name="image1" descr="lộ trình demo · 10 bước, 12 tuần (tối đa 15)"/>
             <a:graphic xmlns:a="http://schemas.openxmlformats.org/drawingml/2006/main">
               <a:graphicData uri="http://schemas.openxmlformats.org/drawingml/2006/picture">
                 <pic:pic xmlns:pic="http://schemas.openxmlformats.org/drawingml/2006/picture">
                   <pic:nvPicPr>
-                    <pic:cNvPr id="1" name="image1" descr="lộ trình demo · 10 bước, 16 tuần"/>
+                    <pic:cNvPr id="1" name="image1" descr="lộ trình demo · 10 bước, 12 tuần (tối đa 15)"/>
                     <pic:cNvPicPr/>
                   </pic:nvPicPr>
                   <pic:blipFill>
@@ -59,7 +65,7 @@
                   <pic:spPr>
                     <a:xfrm>
                       <a:off x="0" y="0"/>
-                      <a:ext cx="5486400" cy="2881992"/>
+                      <a:ext cx="5486400" cy="3093835"/>
                     </a:xfrm>
                     <a:prstGeom prst="rect">
                       <a:avLst/>
@@ -75,7 +81,7 @@
     <w:p>
       <w:pPr/>
       <w:r>
-        <w:t xml:space="preserve">lộ trình demo · 10 bước, 16 tuần</w:t>
+        <w:t xml:space="preserve">lộ trình demo · 10 bước, 12 tuần (tối đa 15)</w:t>
       </w:r>
     </w:p>
     <w:p>
@@ -92,8 +98,8 @@
         <w:tblLook w:val="04A0" w:firstRow="1" w:lastRow="0" w:firstColumn="0" w:lastColumn="0" w:noHBand="0" w:noVBand="1"/>
       </w:tblPr>
       <w:tblGrid>
-        <w:gridCol w:w="962"/>
-        <w:gridCol w:w="1485"/>
+        <w:gridCol w:w="1180"/>
+        <w:gridCol w:w="1267"/>
         <w:gridCol w:w="3193"/>
         <w:gridCol w:w="2179"/>
         <w:gridCol w:w="1541"/>
@@ -104,7 +110,7 @@
         </w:trPr>
         <w:tc>
           <w:tcPr>
-            <w:tcW w:w="962" w:type="dxa"/>
+            <w:tcW w:w="1180" w:type="dxa"/>
             <w:shd w:val="clear" w:color="auto" w:fill="F2F2F2"/>
           </w:tcPr>
           <w:p>
@@ -116,7 +122,7 @@
         </w:tc>
         <w:tc>
           <w:tcPr>
-            <w:tcW w:w="1485" w:type="dxa"/>
+            <w:tcW w:w="1267" w:type="dxa"/>
             <w:shd w:val="clear" w:color="auto" w:fill="F2F2F2"/>
           </w:tcPr>
           <w:p>
@@ -166,7 +172,64 @@
       <w:tr>
         <w:tc>
           <w:tcPr>
-            <w:tcW w:w="962" w:type="dxa"/>
+            <w:tcW w:w="1180" w:type="dxa"/>
+          </w:tcPr>
+          <w:p>
+            <w:pPr/>
+            <w:r>
+              <w:t xml:space="preserve">0. Prototype v1.0 (đã xong)</w:t>
+            </w:r>
+          </w:p>
+        </w:tc>
+        <w:tc>
+          <w:tcPr>
+            <w:tcW w:w="1267" w:type="dxa"/>
+          </w:tcPr>
+          <w:p>
+            <w:pPr/>
+            <w:r>
+              <w:t xml:space="preserve">24-28/10/2026 (trước T1)</w:t>
+            </w:r>
+          </w:p>
+        </w:tc>
+        <w:tc>
+          <w:tcPr>
+            <w:tcW w:w="3193" w:type="dxa"/>
+          </w:tcPr>
+          <w:p>
+            <w:pPr/>
+            <w:r>
+              <w:t xml:space="preserve">Dựng prototype từ prompt ở Phần 3: sa bàn 3D, luồng 6 màn, chế độ giáo viên và học sinh, nội dung giả lập ghi rõ chưa được chuyên gia duyệt</w:t>
+            </w:r>
+          </w:p>
+        </w:tc>
+        <w:tc>
+          <w:tcPr>
+            <w:tcW w:w="2179" w:type="dxa"/>
+          </w:tcPr>
+          <w:p>
+            <w:pPr/>
+            <w:r>
+              <w:t xml:space="preserve">Prototype chạy trên trình duyệt; dùng để giới thiệu với đối tác ở bước 2 và thử luồng. Chưa phải nội dung đã duyệt</w:t>
+            </w:r>
+          </w:p>
+        </w:tc>
+        <w:tc>
+          <w:tcPr>
+            <w:tcW w:w="1541" w:type="dxa"/>
+          </w:tcPr>
+          <w:p>
+            <w:pPr/>
+            <w:r>
+              <w:t xml:space="preserve">Team dự án</w:t>
+            </w:r>
+          </w:p>
+        </w:tc>
+      </w:tr>
+      <w:tr>
+        <w:tc>
+          <w:tcPr>
+            <w:tcW w:w="1180" w:type="dxa"/>
           </w:tcPr>
           <w:p>
             <w:pPr/>
@@ -177,12 +240,12 @@
         </w:tc>
         <w:tc>
           <w:tcPr>
-            <w:tcW w:w="1485" w:type="dxa"/>
-          </w:tcPr>
-          <w:p>
-            <w:pPr/>
-            <w:r>
-              <w:t xml:space="preserve">Tuần 1-2</w:t>
+            <w:tcW w:w="1267" w:type="dxa"/>
+          </w:tcPr>
+          <w:p>
+            <w:pPr/>
+            <w:r>
+              <w:t xml:space="preserve">Tuần 1</w:t>
             </w:r>
           </w:p>
         </w:tc>
@@ -193,7 +256,7 @@
           <w:p>
             <w:pPr/>
             <w:r>
-              <w:t xml:space="preserve">Chọn đúng 1 bài, cấp học (THCS hay THPT), hình thức dùng (cả lớp hay tự học), viết 3 tiêu chí thành công</w:t>
+              <w:t xml:space="preserve">Chọn đúng 1 bài, cấp học (THCS hay THPT), hình thức dùng (cả lớp hay tự học), viết 3 tiêu chí thành công; chốt ngày bắt đầu T1 theo lịch năm học, nhân sự, ngân sách và thiết bị thử</w:t>
             </w:r>
           </w:p>
         </w:tc>
@@ -204,7 +267,7 @@
           <w:p>
             <w:pPr/>
             <w:r>
-              <w:t xml:space="preserve">Tài liệu phạm vi 1 trang; cả team thống nhất</w:t>
+              <w:t xml:space="preserve">Tài liệu phạm vi 1 trang; cả team thống nhất; ngày bắt đầu T1 đã chốt</w:t>
             </w:r>
           </w:p>
         </w:tc>
@@ -223,7 +286,7 @@
       <w:tr>
         <w:tc>
           <w:tcPr>
-            <w:tcW w:w="962" w:type="dxa"/>
+            <w:tcW w:w="1180" w:type="dxa"/>
           </w:tcPr>
           <w:p>
             <w:pPr/>
@@ -234,12 +297,12 @@
         </w:tc>
         <w:tc>
           <w:tcPr>
-            <w:tcW w:w="1485" w:type="dxa"/>
-          </w:tcPr>
-          <w:p>
-            <w:pPr/>
-            <w:r>
-              <w:t xml:space="preserve">Tuần 1-4</w:t>
+            <w:tcW w:w="1267" w:type="dxa"/>
+          </w:tcPr>
+          <w:p>
+            <w:pPr/>
+            <w:r>
+              <w:t xml:space="preserve">Tuần 1-3</w:t>
             </w:r>
           </w:p>
         </w:tc>
@@ -250,7 +313,7 @@
           <w:p>
             <w:pPr/>
             <w:r>
-              <w:t xml:space="preserve">Liên hệ giáo viên sử và cố vấn sử học; thống nhất nguồn tài liệu được dùng và quy trình duyệt</w:t>
+              <w:t xml:space="preserve">Liên hệ giáo viên sử và cố vấn sử học (dùng prototype v1.0 để giới thiệu); thống nhất nguồn tài liệu được dùng và quy trình duyệt; hỏi trước 1-2 lớp có thể thử ở bước 9</w:t>
             </w:r>
           </w:p>
         </w:tc>
@@ -261,7 +324,7 @@
           <w:p>
             <w:pPr/>
             <w:r>
-              <w:t xml:space="preserve">Ít nhất 1 giáo viên và 1 cố vấn đồng ý hợp tác</w:t>
+              <w:t xml:space="preserve">Ít nhất 1 giáo viên và 1 cố vấn đồng ý hợp tác; có lớp dự kiến cho bước 9 (hạn chốt ngày thử với trường: T5)</w:t>
             </w:r>
           </w:p>
         </w:tc>
@@ -280,7 +343,7 @@
       <w:tr>
         <w:tc>
           <w:tcPr>
-            <w:tcW w:w="962" w:type="dxa"/>
+            <w:tcW w:w="1180" w:type="dxa"/>
           </w:tcPr>
           <w:p>
             <w:pPr/>
@@ -291,12 +354,12 @@
         </w:tc>
         <w:tc>
           <w:tcPr>
-            <w:tcW w:w="1485" w:type="dxa"/>
-          </w:tcPr>
-          <w:p>
-            <w:pPr/>
-            <w:r>
-              <w:t xml:space="preserve">Tuần 3-6</w:t>
+            <w:tcW w:w="1267" w:type="dxa"/>
+          </w:tcPr>
+          <w:p>
+            <w:pPr/>
+            <w:r>
+              <w:t xml:space="preserve">Tuần 2-4</w:t>
             </w:r>
           </w:p>
         </w:tc>
@@ -318,7 +381,7 @@
           <w:p>
             <w:pPr/>
             <w:r>
-              <w:t xml:space="preserve">Kho dữ liệu có nguồn; cố vấn sử học duyệt xong</w:t>
+              <w:t xml:space="preserve">Kho dữ liệu có nguồn; cố vấn sử học duyệt xong ở cuối T4, từ đó nội dung chỉ đổi qua quy trình duyệt</w:t>
             </w:r>
           </w:p>
         </w:tc>
@@ -337,7 +400,7 @@
       <w:tr>
         <w:tc>
           <w:tcPr>
-            <w:tcW w:w="962" w:type="dxa"/>
+            <w:tcW w:w="1180" w:type="dxa"/>
           </w:tcPr>
           <w:p>
             <w:pPr/>
@@ -348,12 +411,12 @@
         </w:tc>
         <w:tc>
           <w:tcPr>
-            <w:tcW w:w="1485" w:type="dxa"/>
-          </w:tcPr>
-          <w:p>
-            <w:pPr/>
-            <w:r>
-              <w:t xml:space="preserve">Tuần 4-6</w:t>
+            <w:tcW w:w="1267" w:type="dxa"/>
+          </w:tcPr>
+          <w:p>
+            <w:pPr/>
+            <w:r>
+              <w:t xml:space="preserve">Tuần 3-4</w:t>
             </w:r>
           </w:p>
         </w:tc>
@@ -364,7 +427,7 @@
           <w:p>
             <w:pPr/>
             <w:r>
-              <w:t xml:space="preserve">Viết kịch bản 15-20 phút, chọn 3-5 biến số học sinh được đổi, soạn câu hỏi của nhân vật</w:t>
+              <w:t xml:space="preserve">Viết kịch bản 15-20 phút, chọn 3-5 biến số học sinh được đổi, soạn câu hỏi và lời giải thích của nhân vật cho từng lựa chọn (F4, F8)</w:t>
             </w:r>
           </w:p>
         </w:tc>
@@ -394,7 +457,7 @@
       <w:tr>
         <w:tc>
           <w:tcPr>
-            <w:tcW w:w="962" w:type="dxa"/>
+            <w:tcW w:w="1180" w:type="dxa"/>
           </w:tcPr>
           <w:p>
             <w:pPr/>
@@ -405,12 +468,12 @@
         </w:tc>
         <w:tc>
           <w:tcPr>
-            <w:tcW w:w="1485" w:type="dxa"/>
-          </w:tcPr>
-          <w:p>
-            <w:pPr/>
-            <w:r>
-              <w:t xml:space="preserve">Tuần 6-11</w:t>
+            <w:tcW w:w="1267" w:type="dxa"/>
+          </w:tcPr>
+          <w:p>
+            <w:pPr/>
+            <w:r>
+              <w:t xml:space="preserve">Tuần 4-7</w:t>
             </w:r>
           </w:p>
         </w:tc>
@@ -421,7 +484,7 @@
           <w:p>
             <w:pPr/>
             <w:r>
-              <w:t xml:space="preserve">Xây mô hình theo luật (vị trí, quân số, tốc độ, tâm lý, địa hình, hậu cần); ghi rõ giả định và tham số</w:t>
+              <w:t xml:space="preserve">Xây mô hình theo luật (vị trí, quân số, tốc độ, tâm lý, địa hình, hậu cần); ghi rõ giả định và tham số; gửi bảng giả định cho cố vấn xem ở T6</w:t>
             </w:r>
           </w:p>
         </w:tc>
@@ -451,7 +514,7 @@
       <w:tr>
         <w:tc>
           <w:tcPr>
-            <w:tcW w:w="962" w:type="dxa"/>
+            <w:tcW w:w="1180" w:type="dxa"/>
           </w:tcPr>
           <w:p>
             <w:pPr/>
@@ -462,12 +525,12 @@
         </w:tc>
         <w:tc>
           <w:tcPr>
-            <w:tcW w:w="1485" w:type="dxa"/>
-          </w:tcPr>
-          <w:p>
-            <w:pPr/>
-            <w:r>
-              <w:t xml:space="preserve">Tuần 6-11</w:t>
+            <w:tcW w:w="1267" w:type="dxa"/>
+          </w:tcPr>
+          <w:p>
+            <w:pPr/>
+            <w:r>
+              <w:t xml:space="preserve">Tuần 4-7</w:t>
             </w:r>
           </w:p>
         </w:tc>
@@ -478,7 +541,7 @@
           <w:p>
             <w:pPr/>
             <w:r>
-              <w:t xml:space="preserve">Dựng địa hình, quân, voi, trang phục chạy trên trình duyệt, ưu tiên nhẹ</w:t>
+              <w:t xml:space="preserve">Dựng địa hình, quân, voi, trang phục chạy trên trình duyệt, ưu tiên nhẹ; thử trên máy yếu thật của trường từ T5</w:t>
             </w:r>
           </w:p>
         </w:tc>
@@ -508,7 +571,7 @@
       <w:tr>
         <w:tc>
           <w:tcPr>
-            <w:tcW w:w="962" w:type="dxa"/>
+            <w:tcW w:w="1180" w:type="dxa"/>
           </w:tcPr>
           <w:p>
             <w:pPr/>
@@ -519,12 +582,12 @@
         </w:tc>
         <w:tc>
           <w:tcPr>
-            <w:tcW w:w="1485" w:type="dxa"/>
-          </w:tcPr>
-          <w:p>
-            <w:pPr/>
-            <w:r>
-              <w:t xml:space="preserve">Tuần 8-11</w:t>
+            <w:tcW w:w="1267" w:type="dxa"/>
+          </w:tcPr>
+          <w:p>
+            <w:pPr/>
+            <w:r>
+              <w:t xml:space="preserve">Tuần 5-7</w:t>
             </w:r>
           </w:p>
         </w:tc>
@@ -535,7 +598,7 @@
           <w:p>
             <w:pPr/>
             <w:r>
-              <w:t xml:space="preserve">Vua Quang Trung dùng LLM kết hợp RAG trên kho dữ liệu đã duyệt; soạn bộ câu hỏi kiểm thử, kể cả câu hỏi gài</w:t>
+              <w:t xml:space="preserve">Phần P0 (nhân vật hỏi và giải thích theo kịch bản, F4, F8) không cần LLM. Phần P1 (F9): vua Quang Trung dùng LLM kết hợp RAG trên kho dữ liệu đã duyệt; soạn bộ câu hỏi kiểm thử, kể cả câu hỏi gài</w:t>
             </w:r>
           </w:p>
         </w:tc>
@@ -546,7 +609,7 @@
           <w:p>
             <w:pPr/>
             <w:r>
-              <w:t xml:space="preserve">Trả lời có trích nguồn; tỷ lệ sai hoặc bịa trong bộ kiểm thử dưới ngưỡng team đặt</w:t>
+              <w:t xml:space="preserve">Trả lời có trích nguồn; tỷ lệ sai hoặc bịa trong bộ kiểm thử dưới ngưỡng team đặt. Nếu đến T7 chưa đạt thì cắt F9 khỏi demo, giữ nhân vật theo kịch bản</w:t>
             </w:r>
           </w:p>
         </w:tc>
@@ -565,23 +628,23 @@
       <w:tr>
         <w:tc>
           <w:tcPr>
-            <w:tcW w:w="962" w:type="dxa"/>
-          </w:tcPr>
-          <w:p>
-            <w:pPr/>
-            <w:r>
-              <w:t xml:space="preserve">8. Ghép demo</w:t>
-            </w:r>
-          </w:p>
-        </w:tc>
-        <w:tc>
-          <w:tcPr>
-            <w:tcW w:w="1485" w:type="dxa"/>
-          </w:tcPr>
-          <w:p>
-            <w:pPr/>
-            <w:r>
-              <w:t xml:space="preserve">Tuần 12-13</w:t>
+            <w:tcW w:w="1180" w:type="dxa"/>
+          </w:tcPr>
+          <w:p>
+            <w:pPr/>
+            <w:r>
+              <w:t xml:space="preserve">8. Ghép demo và chuẩn bị</w:t>
+            </w:r>
+          </w:p>
+        </w:tc>
+        <w:tc>
+          <w:tcPr>
+            <w:tcW w:w="1267" w:type="dxa"/>
+          </w:tcPr>
+          <w:p>
+            <w:pPr/>
+            <w:r>
+              <w:t xml:space="preserve">Tuần 8-9</w:t>
             </w:r>
           </w:p>
         </w:tc>
@@ -592,7 +655,7 @@
           <w:p>
             <w:pPr/>
             <w:r>
-              <w:t xml:space="preserve">Ghép thành buổi học trọn vẹn, kiểm thử nội bộ, sửa lỗi, tối ưu hiệu năng</w:t>
+              <w:t xml:space="preserve">T8: ghép thành buổi học trọn vẹn, kiểm thử nội bộ, sửa lỗi, tối ưu hiệu năng. T9: sửa lỗi còn lại, giáo viên hợp tác chạy thử, chuẩn bị phiếu đồng ý của nhà trường và phụ huynh, bộ khảo sát và bài kiểm tra trước và sau (F11 hoặc phiếu giấy)</w:t>
             </w:r>
           </w:p>
         </w:tc>
@@ -603,7 +666,7 @@
           <w:p>
             <w:pPr/>
             <w:r>
-              <w:t xml:space="preserve">Demo chạy từ đầu đến cuối không lỗi chặn</w:t>
+              <w:t xml:space="preserve">Demo chạy từ đầu đến cuối không lỗi chặn, sẵn sàng vào lớp, có phiếu đồng ý (hết T9)</w:t>
             </w:r>
           </w:p>
         </w:tc>
@@ -622,7 +685,7 @@
       <w:tr>
         <w:tc>
           <w:tcPr>
-            <w:tcW w:w="962" w:type="dxa"/>
+            <w:tcW w:w="1180" w:type="dxa"/>
           </w:tcPr>
           <w:p>
             <w:pPr/>
@@ -633,12 +696,12 @@
         </w:tc>
         <w:tc>
           <w:tcPr>
-            <w:tcW w:w="1485" w:type="dxa"/>
-          </w:tcPr>
-          <w:p>
-            <w:pPr/>
-            <w:r>
-              <w:t xml:space="preserve">Tuần 14-16</w:t>
+            <w:tcW w:w="1267" w:type="dxa"/>
+          </w:tcPr>
+          <w:p>
+            <w:pPr/>
+            <w:r>
+              <w:t xml:space="preserve">Tuần 10-11</w:t>
             </w:r>
           </w:p>
         </w:tc>
@@ -679,7 +742,7 @@
       <w:tr>
         <w:tc>
           <w:tcPr>
-            <w:tcW w:w="962" w:type="dxa"/>
+            <w:tcW w:w="1180" w:type="dxa"/>
           </w:tcPr>
           <w:p>
             <w:pPr/>
@@ -690,12 +753,12 @@
         </w:tc>
         <w:tc>
           <w:tcPr>
-            <w:tcW w:w="1485" w:type="dxa"/>
-          </w:tcPr>
-          <w:p>
-            <w:pPr/>
-            <w:r>
-              <w:t xml:space="preserve">Tuần 16</w:t>
+            <w:tcW w:w="1267" w:type="dxa"/>
+          </w:tcPr>
+          <w:p>
+            <w:pPr/>
+            <w:r>
+              <w:t xml:space="preserve">Tuần 12</w:t>
             </w:r>
           </w:p>
         </w:tc>
@@ -737,7 +800,61 @@
     <w:p>
       <w:pPr/>
       <w:r>
-        <w:t xml:space="preserve">Bước 2 chạy song song với bước 1 và 3 vì tìm chuyên gia là điểm nghẽn lớn nhất; bước 5, 6, 7 chạy song song sau khi có kịch bản.</w:t>
+        <w:t xml:space="preserve">Bước 2 chạy song song với bước 1 và 3 vì tìm chuyên gia là điểm nghẽn lớn nhất; bước 5, 6, 7 chạy song song khi kịch bản và kho dữ liệu sắp xong. Tuần 4 là điểm dồn: cố vấn duyệt kho dữ liệu, kịch bản xong và bước 5, 6 bắt đầu cùng tuần, nên đây là tuần dễ trễ nhất, PM theo dõi sát. Nếu lỡ mốc, dùng quỹ dự phòng T13-15; hết T15 mà chưa xong thì cắt phạm vi (F9, F10, F11 trước), không kéo dài thêm.</w:t>
+      </w:r>
+    </w:p>
+    <w:p>
+      <w:pPr/>
+      <w:r>
+        <w:t xml:space="preserve">Mốc kiểm soát giữa kỳ:</w:t>
+      </w:r>
+    </w:p>
+    <w:p>
+      <w:pPr>
+        <w:pStyle w:val="ListParagraph"/>
+        <w:numPr>
+          <w:ilvl w:val="0"/>
+          <w:numId w:val="2"/>
+        </w:numPr>
+      </w:pPr>
+      <w:r>
+        <w:t xml:space="preserve">T4: cố vấn sử học duyệt xong kho dữ liệu. T5: chốt lớp và ngày thử nghiệm với nhà trường; thử cảnh 3D trên máy yếu thật.</w:t>
+      </w:r>
+    </w:p>
+    <w:p>
+      <w:pPr>
+        <w:pStyle w:val="ListParagraph"/>
+        <w:numPr>
+          <w:ilvl w:val="0"/>
+          <w:numId w:val="2"/>
+        </w:numPr>
+      </w:pPr>
+      <w:r>
+        <w:t xml:space="preserve">T6: cố vấn sử học xem bảng giả định của engine.</w:t>
+      </w:r>
+    </w:p>
+    <w:p>
+      <w:pPr>
+        <w:pStyle w:val="ListParagraph"/>
+        <w:numPr>
+          <w:ilvl w:val="0"/>
+          <w:numId w:val="2"/>
+        </w:numPr>
+      </w:pPr>
+      <w:r>
+        <w:t xml:space="preserve">T7: nếu bộ câu hỏi kiểm thử của nhân vật AI chưa đạt ngưỡng thì cắt F9 (P1) khỏi demo.</w:t>
+      </w:r>
+    </w:p>
+    <w:p>
+      <w:pPr>
+        <w:pStyle w:val="ListParagraph"/>
+        <w:numPr>
+          <w:ilvl w:val="0"/>
+          <w:numId w:val="2"/>
+        </w:numPr>
+      </w:pPr>
+      <w:r>
+        <w:t xml:space="preserve">T9: demo chạy hết luồng, sẵn sàng vào lớp, có phiếu đồng ý.</w:t>
       </w:r>
     </w:p>
     <w:p>
@@ -2380,6 +2497,54 @@
           </w:p>
         </w:tc>
       </w:tr>
+      <w:tr>
+        <w:tc>
+          <w:tcPr>
+            <w:tcW w:w="4440" w:type="dxa"/>
+          </w:tcPr>
+          <w:p>
+            <w:pPr/>
+            <w:r>
+              <w:t xml:space="preserve">Lớp thử nghiệm trùng kỳ nghỉ hoặc kỳ thi của trường (ví dụ T1 là 16/11/2026 thì buổi thử ở T10-11 rơi vào 18-31/01/2027, còn quỹ dự phòng T13-15 rơi vào kỳ nghỉ Tết Đinh Mùi, mùng 1 là 6/2/2027; T1 càng muộn thì buổi thử càng bị đẩy vào Tết)</w:t>
+            </w:r>
+          </w:p>
+        </w:tc>
+        <w:tc>
+          <w:tcPr>
+            <w:tcW w:w="4920" w:type="dxa"/>
+          </w:tcPr>
+          <w:p>
+            <w:pPr/>
+            <w:r>
+              <w:t xml:space="preserve">Chốt ngày T1 theo lịch năm học ở bước 1; chốt ngày thử với trường chậm nhất ở T5; với mức tối đa 15 tuần, nếu T1 muộn thì không còn chỗ dời bước 9 sang sau Tết</w:t>
+            </w:r>
+          </w:p>
+        </w:tc>
+      </w:tr>
+      <w:tr>
+        <w:tc>
+          <w:tcPr>
+            <w:tcW w:w="4440" w:type="dxa"/>
+          </w:tcPr>
+          <w:p>
+            <w:pPr/>
+            <w:r>
+              <w:t xml:space="preserve">Nhà trường hoặc phụ huynh không đồng ý cho thu dữ liệu của học sinh vị thành niên</w:t>
+            </w:r>
+          </w:p>
+        </w:tc>
+        <w:tc>
+          <w:tcPr>
+            <w:tcW w:w="4920" w:type="dxa"/>
+          </w:tcPr>
+          <w:p>
+            <w:pPr/>
+            <w:r>
+              <w:t xml:space="preserve">Chuẩn bị phiếu đồng ý xong ở T9 (bước 8); chỉ thu dữ liệu ẩn danh; có phương án khảo sát bằng phiếu giấy</w:t>
+            </w:r>
+          </w:p>
+        </w:tc>
+      </w:tr>
     </w:tbl>
     <w:p>
       <w:pPr>
@@ -2392,7 +2557,7 @@
     <w:p>
       <w:pPr/>
       <w:r>
-        <w:t xml:space="preserve">Tổng cộng khoảng 16 tuần, chi tiết từng bước ở Phần 1. Mốc chính: tuần 6 có kho dữ liệu đã duyệt và kịch bản; tuần 11 có engine, cảnh 3D và nhân vật; tuần 13 có demo hoàn chỉnh; tuần 16 có báo cáo thử nghiệm.</w:t>
+        <w:t xml:space="preserve">Tổng cộng 12 tuần, tối đa 15 tuần nếu dùng quỹ dự phòng (không tính bước 0 đã xong), chi tiết từng bước ở Phần 1. Mốc chính: tuần 4 có kho dữ liệu đã duyệt và kịch bản; tuần 7 có engine, cảnh 3D và nhân vật; tuần 9 có demo hoàn chỉnh, sẵn sàng vào lớp; tuần 11 thử xong; tuần 12 có báo cáo thử nghiệm.</w:t>
       </w:r>
     </w:p>
     <w:p>
@@ -2473,6 +2638,18 @@
       </w:pPr>
       <w:r>
         <w:t xml:space="preserve">Nhân sự, ngân sách và thiết bị thử nghiệm của team là gì?</w:t>
+      </w:r>
+    </w:p>
+    <w:p>
+      <w:pPr>
+        <w:pStyle w:val="ListParagraph"/>
+        <w:numPr>
+          <w:ilvl w:val="0"/>
+          <w:numId w:val="8"/>
+        </w:numPr>
+      </w:pPr>
+      <w:r>
+        <w:t xml:space="preserve">Tuần 1 (T1) bắt đầu từ ngày nào, và lịch năm học, kỳ nghỉ, kỳ thi của trường thử nghiệm ra sao?</w:t>
       </w:r>
     </w:p>
     <w:p>

</xml_diff>